<commit_message>
uploading presentation for this project
</commit_message>
<xml_diff>
--- a/Document/HabotConnect Hiring Project.docx
+++ b/Document/HabotConnect Hiring Project.docx
@@ -2082,6 +2082,8 @@
       <w:r>
         <w:rPr>
           <w:rFonts w:ascii="Times New Roman" w:hAnsi="Times New Roman" w:cs="Times New Roman"/>
+          <w:noProof/>
+          <w:lang w:val="en-IN" w:eastAsia="en-IN"/>
         </w:rPr>
         <w:drawing>
           <wp:inline distT="0" distB="0" distL="0" distR="0" wp14:anchorId="5F0068B0" wp14:editId="35309F73">
@@ -2157,7 +2159,7 @@
         <w:rPr>
           <w:rFonts w:ascii="Times New Roman" w:hAnsi="Times New Roman" w:cs="Times New Roman"/>
           <w:noProof/>
-          <w:lang w:eastAsia="en-IN"/>
+          <w:lang w:val="en-IN" w:eastAsia="en-IN"/>
         </w:rPr>
         <w:drawing>
           <wp:inline distT="0" distB="0" distL="0" distR="0" wp14:anchorId="08AFF56C" wp14:editId="6166DF70">
@@ -2657,6 +2659,8 @@
       <w:r>
         <w:rPr>
           <w:rFonts w:ascii="Times New Roman" w:hAnsi="Times New Roman" w:cs="Times New Roman"/>
+          <w:noProof/>
+          <w:lang w:val="en-IN" w:eastAsia="en-IN"/>
         </w:rPr>
         <w:drawing>
           <wp:inline distT="0" distB="0" distL="0" distR="0" wp14:anchorId="35D25C4A" wp14:editId="178AC8B6">
@@ -2724,7 +2728,7 @@
         <w:rPr>
           <w:rFonts w:ascii="Times New Roman" w:hAnsi="Times New Roman" w:cs="Times New Roman"/>
           <w:noProof/>
-          <w:lang w:eastAsia="en-IN"/>
+          <w:lang w:val="en-IN" w:eastAsia="en-IN"/>
         </w:rPr>
         <w:drawing>
           <wp:inline distT="0" distB="0" distL="0" distR="0" wp14:anchorId="0C19F6B0" wp14:editId="5B19796E">
@@ -3761,6 +3765,8 @@
       <w:r>
         <w:rPr>
           <w:rFonts w:ascii="Times New Roman" w:hAnsi="Times New Roman" w:cs="Times New Roman"/>
+          <w:noProof/>
+          <w:lang w:val="en-IN" w:eastAsia="en-IN"/>
         </w:rPr>
         <w:drawing>
           <wp:inline distT="0" distB="0" distL="0" distR="0" wp14:anchorId="543590CB" wp14:editId="0179F605">
@@ -4751,7 +4757,7 @@
         <w:rPr>
           <w:rFonts w:ascii="Times New Roman" w:hAnsi="Times New Roman" w:cs="Times New Roman"/>
           <w:noProof/>
-          <w:lang w:eastAsia="en-IN"/>
+          <w:lang w:val="en-IN" w:eastAsia="en-IN"/>
         </w:rPr>
         <w:drawing>
           <wp:inline distT="0" distB="0" distL="0" distR="0" wp14:anchorId="14AD9A9A" wp14:editId="6310C841">
@@ -4818,6 +4824,8 @@
       <w:r>
         <w:rPr>
           <w:rFonts w:ascii="Times New Roman" w:hAnsi="Times New Roman" w:cs="Times New Roman"/>
+          <w:noProof/>
+          <w:lang w:val="en-IN" w:eastAsia="en-IN"/>
         </w:rPr>
         <w:drawing>
           <wp:inline distT="0" distB="0" distL="0" distR="0" wp14:anchorId="043EFB0A" wp14:editId="7F3172E4">
@@ -5437,6 +5445,8 @@
       <w:r>
         <w:rPr>
           <w:rFonts w:ascii="Times New Roman" w:hAnsi="Times New Roman" w:cs="Times New Roman"/>
+          <w:noProof/>
+          <w:lang w:val="en-IN" w:eastAsia="en-IN"/>
         </w:rPr>
         <w:drawing>
           <wp:inline distT="0" distB="0" distL="0" distR="0" wp14:anchorId="5F7CB6EE" wp14:editId="33A7760A">
@@ -5486,7 +5496,7 @@
         <w:rPr>
           <w:rFonts w:ascii="Times New Roman" w:hAnsi="Times New Roman" w:cs="Times New Roman"/>
           <w:noProof/>
-          <w:lang w:eastAsia="en-IN"/>
+          <w:lang w:val="en-IN" w:eastAsia="en-IN"/>
         </w:rPr>
         <w:drawing>
           <wp:inline distT="0" distB="0" distL="0" distR="0" wp14:anchorId="7C57B359" wp14:editId="4B8848C7">
@@ -6265,6 +6275,8 @@
       <w:r>
         <w:rPr>
           <w:rFonts w:ascii="Times New Roman" w:hAnsi="Times New Roman" w:cs="Times New Roman"/>
+          <w:noProof/>
+          <w:lang w:val="en-IN" w:eastAsia="en-IN"/>
         </w:rPr>
         <w:drawing>
           <wp:inline distT="0" distB="0" distL="0" distR="0" wp14:anchorId="6D35A117" wp14:editId="1F312BA8">
@@ -6339,6 +6351,8 @@
       <w:r>
         <w:rPr>
           <w:rFonts w:ascii="Times New Roman" w:hAnsi="Times New Roman" w:cs="Times New Roman"/>
+          <w:noProof/>
+          <w:lang w:val="en-IN" w:eastAsia="en-IN"/>
         </w:rPr>
         <w:drawing>
           <wp:inline distT="0" distB="0" distL="0" distR="0" wp14:anchorId="793D556F" wp14:editId="5132545D">
@@ -6387,6 +6401,8 @@
       <w:r>
         <w:rPr>
           <w:rFonts w:ascii="Times New Roman" w:hAnsi="Times New Roman" w:cs="Times New Roman"/>
+          <w:noProof/>
+          <w:lang w:val="en-IN" w:eastAsia="en-IN"/>
         </w:rPr>
         <w:drawing>
           <wp:inline distT="0" distB="0" distL="0" distR="0" wp14:anchorId="63BF2235" wp14:editId="31045466">
@@ -6970,6 +6986,8 @@
       <w:r>
         <w:rPr>
           <w:rFonts w:ascii="Times New Roman" w:hAnsi="Times New Roman" w:cs="Times New Roman"/>
+          <w:noProof/>
+          <w:lang w:val="en-IN" w:eastAsia="en-IN"/>
         </w:rPr>
         <w:drawing>
           <wp:inline distT="0" distB="0" distL="0" distR="0" wp14:anchorId="507A61D0" wp14:editId="5995D1E1">
@@ -7019,7 +7037,7 @@
         <w:rPr>
           <w:rFonts w:ascii="Times New Roman" w:hAnsi="Times New Roman" w:cs="Times New Roman"/>
           <w:noProof/>
-          <w:lang w:eastAsia="en-IN"/>
+          <w:lang w:val="en-IN" w:eastAsia="en-IN"/>
         </w:rPr>
         <w:drawing>
           <wp:inline distT="0" distB="0" distL="0" distR="0" wp14:anchorId="381393A8" wp14:editId="62146720">
@@ -7070,7 +7088,7 @@
           <w:rFonts w:ascii="Times New Roman" w:hAnsi="Times New Roman" w:cs="Times New Roman"/>
         </w:rPr>
         <w:pict>
-          <v:rect id="_x0000_i1030" style="width:0;height:1.5pt" o:hralign="center" o:hrstd="t" o:hr="t" fillcolor="#a0a0a0" stroked="f"/>
+          <v:rect id="_x0000_i1025" style="width:0;height:1.5pt" o:hralign="center" o:hrstd="t" o:hr="t" fillcolor="#a0a0a0" stroked="f"/>
         </w:pict>
       </w:r>
     </w:p>
@@ -7214,6 +7232,8 @@
       <w:r>
         <w:rPr>
           <w:rFonts w:ascii="Times New Roman" w:hAnsi="Times New Roman" w:cs="Times New Roman"/>
+          <w:noProof/>
+          <w:lang w:val="en-IN" w:eastAsia="en-IN"/>
         </w:rPr>
         <w:lastRenderedPageBreak/>
         <w:drawing>
@@ -7265,7 +7285,7 @@
           <w:rFonts w:ascii="Times New Roman" w:hAnsi="Times New Roman" w:cs="Times New Roman"/>
         </w:rPr>
         <w:pict>
-          <v:rect id="_x0000_i1031" style="width:0;height:1.5pt" o:hralign="center" o:hrstd="t" o:hr="t" fillcolor="#a0a0a0" stroked="f"/>
+          <v:rect id="_x0000_i1026" style="width:0;height:1.5pt" o:hralign="center" o:hrstd="t" o:hr="t" fillcolor="#a0a0a0" stroked="f"/>
         </w:pict>
       </w:r>
     </w:p>
@@ -7431,7 +7451,7 @@
         <w:rPr>
           <w:rFonts w:ascii="Times New Roman" w:hAnsi="Times New Roman" w:cs="Times New Roman"/>
           <w:noProof/>
-          <w:lang w:eastAsia="en-IN"/>
+          <w:lang w:val="en-IN" w:eastAsia="en-IN"/>
         </w:rPr>
         <w:drawing>
           <wp:inline distT="0" distB="0" distL="0" distR="0" wp14:anchorId="106266B6" wp14:editId="2A0B03B3">
@@ -7482,7 +7502,7 @@
           <w:rFonts w:ascii="Times New Roman" w:hAnsi="Times New Roman" w:cs="Times New Roman"/>
         </w:rPr>
         <w:pict>
-          <v:rect id="_x0000_i1032" style="width:0;height:1.5pt" o:hralign="center" o:hrstd="t" o:hr="t" fillcolor="#a0a0a0" stroked="f"/>
+          <v:rect id="_x0000_i1027" style="width:0;height:1.5pt" o:hralign="center" o:hrstd="t" o:hr="t" fillcolor="#a0a0a0" stroked="f"/>
         </w:pict>
       </w:r>
     </w:p>
@@ -7649,7 +7669,7 @@
         <w:rPr>
           <w:rFonts w:ascii="Times New Roman" w:hAnsi="Times New Roman" w:cs="Times New Roman"/>
           <w:noProof/>
-          <w:lang w:eastAsia="en-IN"/>
+          <w:lang w:val="en-IN" w:eastAsia="en-IN"/>
         </w:rPr>
         <w:drawing>
           <wp:inline distT="0" distB="0" distL="0" distR="0" wp14:anchorId="7D1AD706" wp14:editId="09B7EA9C">
@@ -7700,7 +7720,7 @@
           <w:rFonts w:ascii="Times New Roman" w:hAnsi="Times New Roman" w:cs="Times New Roman"/>
         </w:rPr>
         <w:pict>
-          <v:rect id="_x0000_i1033" style="width:0;height:1.5pt" o:hralign="center" o:hrstd="t" o:hr="t" fillcolor="#a0a0a0" stroked="f"/>
+          <v:rect id="_x0000_i1028" style="width:0;height:1.5pt" o:hralign="center" o:hrstd="t" o:hr="t" fillcolor="#a0a0a0" stroked="f"/>
         </w:pict>
       </w:r>
     </w:p>
@@ -7808,6 +7828,8 @@
       <w:r>
         <w:rPr>
           <w:rFonts w:ascii="Times New Roman" w:hAnsi="Times New Roman" w:cs="Times New Roman"/>
+          <w:noProof/>
+          <w:lang w:val="en-IN" w:eastAsia="en-IN"/>
         </w:rPr>
         <w:drawing>
           <wp:inline distT="0" distB="0" distL="0" distR="0" wp14:anchorId="0F9D567D" wp14:editId="2944A991">
@@ -7929,6 +7951,8 @@
       <w:r>
         <w:rPr>
           <w:rFonts w:ascii="Times New Roman" w:hAnsi="Times New Roman" w:cs="Times New Roman"/>
+          <w:noProof/>
+          <w:lang w:val="en-IN" w:eastAsia="en-IN"/>
         </w:rPr>
         <w:drawing>
           <wp:inline distT="0" distB="0" distL="0" distR="0" wp14:anchorId="73E9BCB9" wp14:editId="5A246519">
@@ -8009,6 +8033,8 @@
       <w:r>
         <w:rPr>
           <w:rFonts w:ascii="Times New Roman" w:hAnsi="Times New Roman" w:cs="Times New Roman"/>
+          <w:noProof/>
+          <w:lang w:val="en-IN" w:eastAsia="en-IN"/>
         </w:rPr>
         <w:drawing>
           <wp:inline distT="0" distB="0" distL="0" distR="0" wp14:anchorId="729E5F12" wp14:editId="5F659A04">
@@ -8090,7 +8116,7 @@
         <w:rPr>
           <w:rFonts w:ascii="Times New Roman" w:hAnsi="Times New Roman" w:cs="Times New Roman"/>
           <w:noProof/>
-          <w:lang w:eastAsia="en-IN"/>
+          <w:lang w:val="en-IN" w:eastAsia="en-IN"/>
         </w:rPr>
         <w:drawing>
           <wp:inline distT="0" distB="0" distL="0" distR="0" wp14:anchorId="3C25B3B8" wp14:editId="0D6C7F86">
@@ -8159,7 +8185,7 @@
         <w:rPr>
           <w:rFonts w:ascii="Times New Roman" w:hAnsi="Times New Roman" w:cs="Times New Roman"/>
           <w:noProof/>
-          <w:lang w:eastAsia="en-IN"/>
+          <w:lang w:val="en-IN" w:eastAsia="en-IN"/>
         </w:rPr>
         <w:drawing>
           <wp:inline distT="0" distB="0" distL="0" distR="0" wp14:anchorId="6A02B60E" wp14:editId="050F15E0">
@@ -9349,16 +9375,7 @@
           <w:color w:val="auto"/>
           <w:sz w:val="24"/>
         </w:rPr>
-        <w:t>5.</w:t>
-      </w:r>
-      <w:r>
-        <w:rPr>
-          <w:rFonts w:ascii="Times New Roman" w:hAnsi="Times New Roman" w:cs="Times New Roman"/>
-          <w:b/>
-          <w:color w:val="auto"/>
-          <w:sz w:val="24"/>
-        </w:rPr>
-        <w:t>Testing Fail-Closed Pipeline</w:t>
+        <w:t>5.Testing Fail-Closed Pipeline</w:t>
       </w:r>
     </w:p>
     <w:p>
@@ -9432,6 +9449,8 @@
       <w:r>
         <w:rPr>
           <w:rFonts w:ascii="Times New Roman" w:hAnsi="Times New Roman" w:cs="Times New Roman"/>
+          <w:noProof/>
+          <w:lang w:val="en-IN" w:eastAsia="en-IN"/>
         </w:rPr>
         <w:drawing>
           <wp:inline distT="0" distB="0" distL="0" distR="0" wp14:anchorId="062FD2CD" wp14:editId="69CFB54A">
@@ -9541,6 +9560,8 @@
       <w:r>
         <w:rPr>
           <w:rFonts w:ascii="Times New Roman" w:hAnsi="Times New Roman" w:cs="Times New Roman"/>
+          <w:noProof/>
+          <w:lang w:val="en-IN" w:eastAsia="en-IN"/>
         </w:rPr>
         <w:lastRenderedPageBreak/>
         <w:drawing>
@@ -9682,6 +9703,8 @@
       <w:r>
         <w:rPr>
           <w:rFonts w:ascii="Times New Roman" w:hAnsi="Times New Roman" w:cs="Times New Roman"/>
+          <w:noProof/>
+          <w:lang w:val="en-IN" w:eastAsia="en-IN"/>
         </w:rPr>
         <w:drawing>
           <wp:inline distT="0" distB="0" distL="0" distR="0" wp14:anchorId="1717ED8C" wp14:editId="1D9C7A62">
@@ -9797,6 +9820,8 @@
       <w:r>
         <w:rPr>
           <w:rFonts w:ascii="Times New Roman" w:hAnsi="Times New Roman" w:cs="Times New Roman"/>
+          <w:noProof/>
+          <w:lang w:val="en-IN" w:eastAsia="en-IN"/>
         </w:rPr>
         <w:drawing>
           <wp:inline distT="0" distB="0" distL="0" distR="0" wp14:anchorId="17527654" wp14:editId="079144A3">
@@ -9950,6 +9975,7 @@
       <w:r>
         <w:rPr>
           <w:rFonts w:ascii="Times New Roman" w:hAnsi="Times New Roman" w:cs="Times New Roman"/>
+          <w:noProof/>
           <w:sz w:val="24"/>
           <w:szCs w:val="24"/>
         </w:rPr>
@@ -10028,6 +10054,7 @@
       <w:r>
         <w:rPr>
           <w:rFonts w:ascii="Times New Roman" w:hAnsi="Times New Roman" w:cs="Times New Roman"/>
+          <w:noProof/>
           <w:sz w:val="24"/>
           <w:szCs w:val="24"/>
         </w:rPr>
@@ -10071,13 +10098,44 @@
     <w:p>
       <w:pPr>
         <w:pStyle w:val="Heading1"/>
+        <w:spacing w:before="0" w:line="276" w:lineRule="auto"/>
         <w:rPr>
           <w:rFonts w:ascii="Times New Roman" w:hAnsi="Times New Roman" w:cs="Times New Roman"/>
           <w:b/>
           <w:color w:val="000000" w:themeColor="text1"/>
-          <w:sz w:val="28"/>
-        </w:rPr>
-      </w:pPr>
+          <w:sz w:val="24"/>
+        </w:rPr>
+      </w:pPr>
+      <w:r>
+        <w:rPr>
+          <w:rFonts w:ascii="Times New Roman" w:hAnsi="Times New Roman" w:cs="Times New Roman"/>
+          <w:b/>
+          <w:color w:val="000000" w:themeColor="text1"/>
+          <w:sz w:val="24"/>
+        </w:rPr>
+        <w:t>Fail-Closed Demonstration</w:t>
+      </w:r>
+      <w:bookmarkStart w:id="0" w:name="_GoBack"/>
+      <w:bookmarkEnd w:id="0"/>
+    </w:p>
+    <w:p>
+      <w:pPr>
+        <w:pStyle w:val="Heading1"/>
+        <w:spacing w:before="0" w:after="0" w:line="276" w:lineRule="auto"/>
+        <w:rPr>
+          <w:rFonts w:ascii="Times New Roman" w:hAnsi="Times New Roman" w:cs="Times New Roman"/>
+          <w:color w:val="000000" w:themeColor="text1"/>
+          <w:sz w:val="24"/>
+        </w:rPr>
+      </w:pPr>
+      <w:r>
+        <w:rPr>
+          <w:rFonts w:ascii="Times New Roman" w:hAnsi="Times New Roman" w:cs="Times New Roman"/>
+          <w:color w:val="000000" w:themeColor="text1"/>
+          <w:sz w:val="24"/>
+        </w:rPr>
+        <w:t>The GitHub Actions pipeline automatically runs Black, Flake8, Bandit, Detect-Secrets, Terraform Validate, and Terraform Plan on every push. If any check fails, the pipeline stops immediately and blocks deployment. After fixing the issue, the pipeline runs successfully and allows deployment.</w:t>
+      </w:r>
     </w:p>
     <w:p>
       <w:pPr>
@@ -10203,6 +10261,9 @@
         <w:pStyle w:val="NormalWeb"/>
       </w:pPr>
       <w:r>
+        <w:rPr>
+          <w:noProof/>
+        </w:rPr>
         <w:lastRenderedPageBreak/>
         <w:drawing>
           <wp:inline distT="0" distB="0" distL="0" distR="0" wp14:anchorId="169196BB" wp14:editId="4E703065">
@@ -10505,6 +10566,8 @@
       <w:r>
         <w:rPr>
           <w:rFonts w:ascii="Times New Roman" w:hAnsi="Times New Roman" w:cs="Times New Roman"/>
+          <w:noProof/>
+          <w:lang w:val="en-IN" w:eastAsia="en-IN"/>
         </w:rPr>
         <w:lastRenderedPageBreak/>
         <w:drawing>
@@ -11901,6 +11964,8 @@
       <w:r>
         <w:rPr>
           <w:rFonts w:ascii="Times New Roman" w:hAnsi="Times New Roman" w:cs="Times New Roman"/>
+          <w:noProof/>
+          <w:lang w:val="en-IN" w:eastAsia="en-IN"/>
         </w:rPr>
         <w:drawing>
           <wp:inline distT="0" distB="0" distL="0" distR="0" wp14:anchorId="55D020FA" wp14:editId="335603E1">
@@ -12061,6 +12126,8 @@
       <w:r>
         <w:rPr>
           <w:rFonts w:ascii="Times New Roman" w:hAnsi="Times New Roman" w:cs="Times New Roman"/>
+          <w:noProof/>
+          <w:lang w:val="en-IN" w:eastAsia="en-IN"/>
         </w:rPr>
         <w:lastRenderedPageBreak/>
         <w:drawing>
@@ -12218,6 +12285,8 @@
       <w:r>
         <w:rPr>
           <w:rFonts w:ascii="Times New Roman" w:hAnsi="Times New Roman" w:cs="Times New Roman"/>
+          <w:noProof/>
+          <w:lang w:val="en-IN" w:eastAsia="en-IN"/>
         </w:rPr>
         <w:drawing>
           <wp:inline distT="0" distB="0" distL="0" distR="0" wp14:anchorId="0C20B21C" wp14:editId="73247A9D">
@@ -12343,6 +12412,8 @@
       <w:r>
         <w:rPr>
           <w:rFonts w:ascii="Times New Roman" w:hAnsi="Times New Roman" w:cs="Times New Roman"/>
+          <w:noProof/>
+          <w:lang w:val="en-IN" w:eastAsia="en-IN"/>
         </w:rPr>
         <w:drawing>
           <wp:inline distT="0" distB="0" distL="0" distR="0" wp14:anchorId="11C993C2" wp14:editId="39E9BD82">
@@ -12463,6 +12534,8 @@
       <w:r>
         <w:rPr>
           <w:rFonts w:ascii="Times New Roman" w:hAnsi="Times New Roman" w:cs="Times New Roman"/>
+          <w:noProof/>
+          <w:lang w:val="en-IN" w:eastAsia="en-IN"/>
         </w:rPr>
         <w:drawing>
           <wp:inline distT="0" distB="0" distL="0" distR="0" wp14:anchorId="6D8890A4" wp14:editId="6CF15514">
@@ -12629,8 +12702,6 @@
           <w:sz w:val="28"/>
         </w:rPr>
       </w:pPr>
-      <w:bookmarkStart w:id="0" w:name="_GoBack"/>
-      <w:bookmarkEnd w:id="0"/>
       <w:r>
         <w:rPr>
           <w:rStyle w:val="Strong"/>

</xml_diff>